<commit_message>
docs: corrige la section driver PKCS#11 (eTPKCS11.dll et IDPrime fonctionnent tous deux)
Test empirique sur la cle de production : eTPKCS11.dll lit le certificat et signe,
au meme titre que IDPrimePKCS1164.dll (meme certificat, meme numero de serie).
Suppression de l'avertissement errone ; IDPrimePKCS1164.dll reste le driver par
defaut (surchargeable via driver / driverPath).
</commit_message>
<xml_diff>
--- a/docs/documentation-clic2up-sign-v1.0.docx
+++ b/docs/documentation-clic2up-sign-v1.0.docx
@@ -459,7 +459,7 @@
           <w:color w:val="1E3A5F"/>
           <w:sz w:val="28"/>
         </w:rPr>
-        <w:t>2.1 Driver a utiliser</w:t>
+        <w:t>2.1 Drivers PKCS#11</w:t>
       </w:r>
     </w:p>
     <w:tbl>
@@ -479,7 +479,7 @@
         </w:trPr>
         <w:tc>
           <w:tcPr>
-            <w:tcW w:type="dxa" w:w="2880"/>
+            <w:tcW w:type="dxa" w:w="3888"/>
             <w:shd w:val="clear" w:color="auto" w:fill="2563EB"/>
           </w:tcPr>
           <w:p>
@@ -496,7 +496,7 @@
         </w:tc>
         <w:tc>
           <w:tcPr>
-            <w:tcW w:type="dxa" w:w="6480"/>
+            <w:tcW w:type="dxa" w:w="5472"/>
             <w:shd w:val="clear" w:color="auto" w:fill="2563EB"/>
           </w:tcPr>
           <w:p>
@@ -515,7 +515,7 @@
       <w:tr>
         <w:tc>
           <w:tcPr>
-            <w:tcW w:type="dxa" w:w="2880"/>
+            <w:tcW w:type="dxa" w:w="3888"/>
           </w:tcPr>
           <w:p>
             <w:r/>
@@ -523,13 +523,13 @@
               <w:rPr>
                 <w:sz w:val="19"/>
               </w:rPr>
-              <w:t>Driver PKCS#11 (correct)</w:t>
+              <w:t>Driver par defaut</w:t>
             </w:r>
           </w:p>
         </w:tc>
         <w:tc>
           <w:tcPr>
-            <w:tcW w:type="dxa" w:w="6480"/>
+            <w:tcW w:type="dxa" w:w="5472"/>
           </w:tcPr>
           <w:p>
             <w:r/>
@@ -545,7 +545,37 @@
       <w:tr>
         <w:tc>
           <w:tcPr>
-            <w:tcW w:type="dxa" w:w="2880"/>
+            <w:tcW w:type="dxa" w:w="3888"/>
+          </w:tcPr>
+          <w:p>
+            <w:r/>
+            <w:r>
+              <w:rPr>
+                <w:sz w:val="19"/>
+              </w:rPr>
+              <w:t>Driver alternatif (fonctionne aussi)</w:t>
+            </w:r>
+          </w:p>
+        </w:tc>
+        <w:tc>
+          <w:tcPr>
+            <w:tcW w:type="dxa" w:w="5472"/>
+          </w:tcPr>
+          <w:p>
+            <w:r/>
+            <w:r>
+              <w:rPr>
+                <w:sz w:val="19"/>
+              </w:rPr>
+              <w:t>C:\Windows\System32\eTPKCS11.dll</w:t>
+            </w:r>
+          </w:p>
+        </w:tc>
+      </w:tr>
+      <w:tr>
+        <w:tc>
+          <w:tcPr>
+            <w:tcW w:type="dxa" w:w="3888"/>
           </w:tcPr>
           <w:p>
             <w:r/>
@@ -559,7 +589,7 @@
         </w:tc>
         <w:tc>
           <w:tcPr>
-            <w:tcW w:type="dxa" w:w="6480"/>
+            <w:tcW w:type="dxa" w:w="5472"/>
           </w:tcPr>
           <w:p>
             <w:r/>
@@ -575,7 +605,7 @@
       <w:tr>
         <w:tc>
           <w:tcPr>
-            <w:tcW w:type="dxa" w:w="2880"/>
+            <w:tcW w:type="dxa" w:w="3888"/>
           </w:tcPr>
           <w:p>
             <w:r/>
@@ -589,7 +619,7 @@
         </w:tc>
         <w:tc>
           <w:tcPr>
-            <w:tcW w:type="dxa" w:w="6480"/>
+            <w:tcW w:type="dxa" w:w="5472"/>
           </w:tcPr>
           <w:p>
             <w:r/>
@@ -605,7 +635,7 @@
       <w:tr>
         <w:tc>
           <w:tcPr>
-            <w:tcW w:type="dxa" w:w="2880"/>
+            <w:tcW w:type="dxa" w:w="3888"/>
           </w:tcPr>
           <w:p>
             <w:r/>
@@ -619,7 +649,7 @@
         </w:tc>
         <w:tc>
           <w:tcPr>
-            <w:tcW w:type="dxa" w:w="6480"/>
+            <w:tcW w:type="dxa" w:w="5472"/>
           </w:tcPr>
           <w:p>
             <w:r/>
@@ -635,7 +665,7 @@
       <w:tr>
         <w:tc>
           <w:tcPr>
-            <w:tcW w:type="dxa" w:w="2880"/>
+            <w:tcW w:type="dxa" w:w="3888"/>
           </w:tcPr>
           <w:p>
             <w:r/>
@@ -649,7 +679,7 @@
         </w:tc>
         <w:tc>
           <w:tcPr>
-            <w:tcW w:type="dxa" w:w="6480"/>
+            <w:tcW w:type="dxa" w:w="5472"/>
           </w:tcPr>
           <w:p>
             <w:r/>
@@ -666,7 +696,7 @@
     <w:p/>
     <w:p>
       <w:pPr>
-        <w:shd w:val="clear" w:color="auto" w:fill="FEF3C7"/>
+        <w:shd w:val="clear" w:color="auto" w:fill="EFF6FF"/>
         <w:spacing w:before="120" w:after="160"/>
         <w:ind w:left="120"/>
       </w:pPr>
@@ -674,10 +704,10 @@
         <w:rPr>
           <w:b/>
         </w:rPr>
-        <w:t xml:space="preserve">Attention : </w:t>
+        <w:t xml:space="preserve">Note : </w:t>
       </w:r>
       <w:r>
-        <w:t>Ne PAS utiliser C:\Windows\System32\eTPKCS11.dll : c'est le driver SafeNet eToken, qui ne correspond PAS a la carte IDPrime de TunTrust. Le driver correct est IDPrimePKCS1164.dll, livre par SafeNet Authentication Client. C'est le driver par defaut code dans clic2up-sign (surchargeable via le parametre 'driver' / 'driverPath').</w:t>
+        <w:t>Les deux modules PKCS#11 de SafeNet Authentication Client accedent a la carte IDPrime et permettent la lecture du certificat ET la signature : IDPrimePKCS1164.dll (module natif IDPrime) et eTPKCS11.dll. Verifie sur la cle de production : les deux lisent le meme certificat (meme numero de serie) et produisent une signature valide. clic2up-sign utilise IDPrimePKCS1164.dll par defaut, surchargeable via le parametre 'driver' (GET /certificates) ou 'driverPath' (POST /sign, /sign-hash).</w:t>
       </w:r>
     </w:p>
     <w:p>

</xml_diff>

<commit_message>
docs: ajoute le fallback de driver et les messages d'erreur FR
- section 2.4 : selection automatique du driver (IDPrime puis eTPKCS11, File.exists, garde PIN)
- section 4.7 : reponses d'erreur et messages FR (pilote absent, cle non branchee, PIN)
- section 2.1 : les deux modules valides de bout en bout jusqu'au QR (package SafeNet Minidriver)
</commit_message>
<xml_diff>
--- a/docs/documentation-clic2up-sign-v1.0.docx
+++ b/docs/documentation-clic2up-sign-v1.0.docx
@@ -707,7 +707,7 @@
         <w:t xml:space="preserve">Note : </w:t>
       </w:r>
       <w:r>
-        <w:t>Les deux modules PKCS#11 de SafeNet Authentication Client accedent a la carte IDPrime et permettent la lecture du certificat ET la signature : IDPrimePKCS1164.dll (module natif IDPrime) et eTPKCS11.dll. Verifie sur la cle de production : les deux lisent le meme certificat (meme numero de serie) et produisent une signature valide. clic2up-sign utilise IDPrimePKCS1164.dll par defaut, surchargeable via le parametre 'driver' (GET /certificates) ou 'driverPath' (POST /sign, /sign-hash).</w:t>
+        <w:t>Les deux modules PKCS#11 accedent a la carte IDPrime et permettent la lecture du certificat ET la signature. Ils sont installes par le meme package SafeNet (Minidriver x64). Verifie sur la cle de production : IDPrimePKCS1164.dll et eTPKCS11.dll lisent le meme certificat (meme numero de serie) et chacun a ete valide DE BOUT EN BOUT jusqu'au QR ElFatoora. clic2up-sign utilise IDPrimePKCS1164.dll par defaut, surchargeable via 'driver' (GET /certificates) ou 'driverPath' (POST /sign, /sign-hash).</w:t>
       </w:r>
     </w:p>
     <w:p>
@@ -997,6 +997,74 @@
           <w:sz w:val="19"/>
         </w:rPr>
         <w:t>ks.load(null, pin.toCharArray());</w:t>
+      </w:r>
+    </w:p>
+    <w:p>
+      <w:pPr>
+        <w:pStyle w:val="Heading2"/>
+      </w:pPr>
+      <w:r>
+        <w:rPr>
+          <w:color w:val="1E3A5F"/>
+          <w:sz w:val="28"/>
+        </w:rPr>
+        <w:t>2.4 Selection automatique du driver (fallback)</w:t>
+      </w:r>
+    </w:p>
+    <w:p>
+      <w:r>
+        <w:rPr>
+          <w:b w:val="0"/>
+        </w:rPr>
+        <w:t>Si aucun driver n'est precise par l'appelant, clic2up-sign essaie automatiquement les modules connus, dans l'ordre, et retient le premier qui ouvre le token et expose une cle :</w:t>
+      </w:r>
+    </w:p>
+    <w:p>
+      <w:pPr>
+        <w:pStyle w:val="ListNumber"/>
+      </w:pPr>
+      <w:r>
+        <w:t>driver explicite fourni par le front (driver / driverPath) : prioritaire, utilise tel quel ;</w:t>
+      </w:r>
+    </w:p>
+    <w:p>
+      <w:pPr>
+        <w:pStyle w:val="ListNumber"/>
+      </w:pPr>
+      <w:r>
+        <w:t>sinon C:\Program Files\SafeNet\Authentication\SAC\x64\IDPrimePKCS1164.dll ;</w:t>
+      </w:r>
+    </w:p>
+    <w:p>
+      <w:pPr>
+        <w:pStyle w:val="ListNumber"/>
+      </w:pPr>
+      <w:r>
+        <w:t>sinon C:\Windows\System32\eTPKCS11.dll.</w:t>
+      </w:r>
+    </w:p>
+    <w:p>
+      <w:r>
+        <w:rPr>
+          <w:b w:val="0"/>
+        </w:rPr>
+        <w:t>Chaque candidat n'est essaye que s'il existe reellement sur le poste (verification File.exists). Cela garantit la portabilite : sur un poste ou le chemin IDPrime differe ou est absent, eTPKCS11.dll (toujours dans System32) prend automatiquement le relais.</w:t>
+      </w:r>
+    </w:p>
+    <w:p>
+      <w:pPr>
+        <w:shd w:val="clear" w:color="auto" w:fill="FEF3C7"/>
+        <w:spacing w:before="120" w:after="160"/>
+        <w:ind w:left="120"/>
+      </w:pPr>
+      <w:r>
+        <w:rPr>
+          <w:b/>
+        </w:rPr>
+        <w:t xml:space="preserve">Attention : </w:t>
+      </w:r>
+      <w:r>
+        <w:t>Garde PIN : si un module trouve le token mais que le PIN est errone (ou la carte deja bloquee), clic2up-sign s'arrete immediatement et NE reessaie PAS avec les autres modules, afin de ne pas consommer plusieurs tentatives de PIN et risquer de bloquer la carte.</w:t>
       </w:r>
     </w:p>
     <w:p>
@@ -2456,6 +2524,214 @@
       </w:tr>
     </w:tbl>
     <w:p/>
+    <w:p>
+      <w:pPr>
+        <w:pStyle w:val="Heading2"/>
+      </w:pPr>
+      <w:r>
+        <w:rPr>
+          <w:color w:val="1E3A5F"/>
+          <w:sz w:val="28"/>
+        </w:rPr>
+        <w:t>4.7 Reponses d'erreur et messages utilisateur</w:t>
+      </w:r>
+    </w:p>
+    <w:p>
+      <w:r>
+        <w:rPr>
+          <w:b w:val="0"/>
+        </w:rPr>
+        <w:t>En cas d'erreur, les endpoints renvoient un JSON { success:false, message, error, errorMessage, stacktrace }. Le champ message est un texte EN FRANCAIS pret a afficher par le front ; les autres champs sont techniques (debug). clic2up-sign classe l'erreur et fournit le bon message :</w:t>
+      </w:r>
+    </w:p>
+    <w:tbl>
+      <w:tblPr>
+        <w:tblStyle w:val="TableGrid"/>
+        <w:tblW w:type="auto" w:w="0"/>
+        <w:jc w:val="center"/>
+        <w:tblLook w:firstColumn="1" w:firstRow="1" w:lastColumn="0" w:lastRow="0" w:noHBand="0" w:noVBand="1" w:val="04A0"/>
+      </w:tblPr>
+      <w:tblGrid>
+        <w:gridCol w:w="4320"/>
+        <w:gridCol w:w="4320"/>
+      </w:tblGrid>
+      <w:tr>
+        <w:trPr>
+          <w:tblHeader w:val="true"/>
+        </w:trPr>
+        <w:tc>
+          <w:tcPr>
+            <w:tcW w:type="dxa" w:w="2592"/>
+            <w:shd w:val="clear" w:color="auto" w:fill="2563EB"/>
+          </w:tcPr>
+          <w:p>
+            <w:r/>
+            <w:r>
+              <w:rPr>
+                <w:b/>
+                <w:color w:val="FFFFFF"/>
+                <w:sz w:val="20"/>
+              </w:rPr>
+              <w:t>Situation</w:t>
+            </w:r>
+          </w:p>
+        </w:tc>
+        <w:tc>
+          <w:tcPr>
+            <w:tcW w:type="dxa" w:w="6768"/>
+            <w:shd w:val="clear" w:color="auto" w:fill="2563EB"/>
+          </w:tcPr>
+          <w:p>
+            <w:r/>
+            <w:r>
+              <w:rPr>
+                <w:b/>
+                <w:color w:val="FFFFFF"/>
+                <w:sz w:val="20"/>
+              </w:rPr>
+              <w:t>message (FR) renvoye par clic2up-sign</w:t>
+            </w:r>
+          </w:p>
+        </w:tc>
+      </w:tr>
+      <w:tr>
+        <w:tc>
+          <w:tcPr>
+            <w:tcW w:type="dxa" w:w="2592"/>
+          </w:tcPr>
+          <w:p>
+            <w:r/>
+            <w:r>
+              <w:rPr>
+                <w:sz w:val="19"/>
+              </w:rPr>
+              <w:t>Aucun pilote installe</w:t>
+            </w:r>
+          </w:p>
+        </w:tc>
+        <w:tc>
+          <w:tcPr>
+            <w:tcW w:type="dxa" w:w="6768"/>
+          </w:tcPr>
+          <w:p>
+            <w:r/>
+            <w:r>
+              <w:rPr>
+                <w:sz w:val="19"/>
+              </w:rPr>
+              <w:t>Aucun pilote de signature n'a ete detecte sur ce poste. Veuillez installer le pilote de la cle (SafeNet Authentication Client).</w:t>
+            </w:r>
+          </w:p>
+        </w:tc>
+      </w:tr>
+      <w:tr>
+        <w:tc>
+          <w:tcPr>
+            <w:tcW w:type="dxa" w:w="2592"/>
+          </w:tcPr>
+          <w:p>
+            <w:r/>
+            <w:r>
+              <w:rPr>
+                <w:sz w:val="19"/>
+              </w:rPr>
+              <w:t>Cle USB non branchee</w:t>
+            </w:r>
+          </w:p>
+        </w:tc>
+        <w:tc>
+          <w:tcPr>
+            <w:tcW w:type="dxa" w:w="6768"/>
+          </w:tcPr>
+          <w:p>
+            <w:r/>
+            <w:r>
+              <w:rPr>
+                <w:sz w:val="19"/>
+              </w:rPr>
+              <w:t>Aucune cle USB de signature detectee. Veuillez brancher votre cle puis reessayer.</w:t>
+            </w:r>
+          </w:p>
+        </w:tc>
+      </w:tr>
+      <w:tr>
+        <w:tc>
+          <w:tcPr>
+            <w:tcW w:type="dxa" w:w="2592"/>
+          </w:tcPr>
+          <w:p>
+            <w:r/>
+            <w:r>
+              <w:rPr>
+                <w:sz w:val="19"/>
+              </w:rPr>
+              <w:t>Code PIN incorrect</w:t>
+            </w:r>
+          </w:p>
+        </w:tc>
+        <w:tc>
+          <w:tcPr>
+            <w:tcW w:type="dxa" w:w="6768"/>
+          </w:tcPr>
+          <w:p>
+            <w:r/>
+            <w:r>
+              <w:rPr>
+                <w:sz w:val="19"/>
+              </w:rPr>
+              <w:t>Code PIN incorrect. Veuillez reessayer (attention : la cle se bloque apres plusieurs erreurs).</w:t>
+            </w:r>
+          </w:p>
+        </w:tc>
+      </w:tr>
+      <w:tr>
+        <w:tc>
+          <w:tcPr>
+            <w:tcW w:type="dxa" w:w="2592"/>
+          </w:tcPr>
+          <w:p>
+            <w:r/>
+            <w:r>
+              <w:rPr>
+                <w:sz w:val="19"/>
+              </w:rPr>
+              <w:t>Cle bloquee</w:t>
+            </w:r>
+          </w:p>
+        </w:tc>
+        <w:tc>
+          <w:tcPr>
+            <w:tcW w:type="dxa" w:w="6768"/>
+          </w:tcPr>
+          <w:p>
+            <w:r/>
+            <w:r>
+              <w:rPr>
+                <w:sz w:val="19"/>
+              </w:rPr>
+              <w:t>Votre cle de signature est bloquee (trop de tentatives de code PIN). Veuillez la debloquer aupres de TunTrust.</w:t>
+            </w:r>
+          </w:p>
+        </w:tc>
+      </w:tr>
+    </w:tbl>
+    <w:p/>
+    <w:p>
+      <w:pPr>
+        <w:shd w:val="clear" w:color="auto" w:fill="EFF6FF"/>
+        <w:spacing w:before="120" w:after="160"/>
+        <w:ind w:left="120"/>
+      </w:pPr>
+      <w:r>
+        <w:rPr>
+          <w:b/>
+        </w:rPr>
+        <w:t xml:space="preserve">Note : </w:t>
+      </w:r>
+      <w:r>
+        <w:t>Repartition des roles : clic2up-sign renvoie le message FR (cle non branchee, pilote absent, PIN incorrect/bloque) et le front l'affiche tel quel. Le seul cas que clic2up-sign ne peut pas signaler lui-meme est « service non lance » (localhost:9876 injoignable) : c'est au front de l'afficher quand l'appel reseau echoue.</w:t>
+      </w:r>
+    </w:p>
     <w:p>
       <w:r>
         <w:br w:type="page"/>

</xml_diff>